<commit_message>
Fix notebook imports, update EDA and weekly deck
</commit_message>
<xml_diff>
--- a/reports/MS_lesion_segmentation_starting_point_and_EDA.docx
+++ b/reports/MS_lesion_segmentation_starting_point_and_EDA.docx
@@ -48,7 +48,7 @@
           <w:sz w:val="22"/>
           <w:szCs w:val="22"/>
         </w:rPr>
-        <w:t xml:space="preserve">Master's thesis — working document</w:t>
+        <w:t xml:space="preserve">Working document</w:t>
       </w:r>
     </w:p>
     <w:p>
@@ -127,7 +127,7 @@
         </w:rPr>
         <w:t xml:space="preserve">Repository: </w:t>
       </w:r>
-      <w:hyperlink w:history="1" r:id="rIdrnyikdn_espnzx88ovwsk">
+      <w:hyperlink w:history="1" r:id="rId9mnxm5_tkakq3ml1nyfhh">
         <w:r>
           <w:rPr>
             <w:rStyle w:val="Hyperlink"/>

</xml_diff>